<commit_message>
fix(docs): conecta Comprador al modelo de dominio
Product/Sale quedaba como un clúster aislado. Se agrega la clase
Comprador (navega el catálogo público sin cuenta y decide la compra)
asociada a Sale con línea punteada, marcando que es una asociación
conceptual y no una FK persistida: el sistema no le lleva identidad
propia, solo guarda el nombre en Sale.buyerName. Quien registra la
venta es un Operador, sin login especial de "vendedor" ni columna
que lo vincule a la venta, por lo que tampoco se agrega esa asociación
formal. 13 clases y 13 asociaciones en total. Se actualiza también el
documento combinado del TP.
</commit_message>
<xml_diff>
--- a/docs/TP_ANALISIS_Y_DISENO_BANCO_DE_ANTEOJOS.docx
+++ b/docs/TP_ANALISIS_Y_DISENO_BANCO_DE_ANTEOJOS.docx
@@ -705,7 +705,7 @@
           <w:i/>
           <w:iCs/>
         </w:rPr>
-        <w:t xml:space="preserve">Las 12 clases del dominio y sus 12 asociaciones, todas en un único diagrama (ninguna relación queda relegada a una nota de texto).</w:t>
+        <w:t xml:space="preserve">Las 13 clases del dominio y sus 13 asociaciones, todas en un único diagrama (ninguna relación queda relegada a una nota de texto).</w:t>
       </w:r>
     </w:p>
     <w:tbl>
@@ -747,7 +747,7 @@
             <w:r>
               <w:drawing>
                 <wp:inline distT="0" distB="0" distL="0" distR="0">
-                  <wp:extent cx="6276975" cy="4552950"/>
+                  <wp:extent cx="6276975" cy="4210050"/>
                   <wp:effectExtent t="0" r="0" b="0" l="0"/>
                   <wp:docPr id="1" name="" descr="" title=""/>
                   <wp:cNvGraphicFramePr>
@@ -772,7 +772,7 @@
                         <pic:spPr bwMode="auto">
                           <a:xfrm>
                             <a:off x="0" y="0"/>
-                            <a:ext cx="6276975" cy="4552950"/>
+                            <a:ext cx="6276975" cy="4210050"/>
                           </a:xfrm>
                           <a:prstGeom prst="rect">
                             <a:avLst/>
@@ -2435,6 +2435,77 @@
           </w:p>
         </w:tc>
       </w:tr>
+      <w:tr>
+        <w:tc>
+          <w:tcPr>
+            <w:tcW w:type="dxa" w:w="2600"/>
+            <w:tcMar>
+              <w:top w:type="dxa" w:w="60"/>
+              <w:left w:type="dxa" w:w="80"/>
+              <w:bottom w:type="dxa" w:w="60"/>
+              <w:right w:type="dxa" w:w="80"/>
+            </w:tcMar>
+            <w:vAlign w:val="center"/>
+          </w:tcPr>
+          <w:p>
+            <w:r>
+              <w:rPr>
+                <w:b w:val="false"/>
+                <w:bCs w:val="false"/>
+                <w:sz w:val="18"/>
+                <w:szCs w:val="18"/>
+              </w:rPr>
+              <w:t xml:space="preserve">Sale — Comprador</w:t>
+            </w:r>
+          </w:p>
+        </w:tc>
+        <w:tc>
+          <w:tcPr>
+            <w:tcW w:type="dxa" w:w="1600"/>
+            <w:tcMar>
+              <w:top w:type="dxa" w:w="60"/>
+              <w:left w:type="dxa" w:w="80"/>
+              <w:bottom w:type="dxa" w:w="60"/>
+              <w:right w:type="dxa" w:w="80"/>
+            </w:tcMar>
+            <w:vAlign w:val="center"/>
+          </w:tcPr>
+          <w:p>
+            <w:r>
+              <w:rPr>
+                <w:b w:val="false"/>
+                <w:bCs w:val="false"/>
+                <w:sz w:val="18"/>
+                <w:szCs w:val="18"/>
+              </w:rPr>
+              <w:t xml:space="preserve">0..* — 1 (conceptual)</w:t>
+            </w:r>
+          </w:p>
+        </w:tc>
+        <w:tc>
+          <w:tcPr>
+            <w:tcW w:type="dxa" w:w="5880"/>
+            <w:tcMar>
+              <w:top w:type="dxa" w:w="60"/>
+              <w:left w:type="dxa" w:w="80"/>
+              <w:bottom w:type="dxa" w:w="60"/>
+              <w:right w:type="dxa" w:w="80"/>
+            </w:tcMar>
+            <w:vAlign w:val="center"/>
+          </w:tcPr>
+          <w:p>
+            <w:r>
+              <w:rPr>
+                <w:b w:val="false"/>
+                <w:bCs w:val="false"/>
+                <w:sz w:val="18"/>
+                <w:szCs w:val="18"/>
+              </w:rPr>
+              <w:t xml:space="preserve">El comprador navega el catálogo y decide la compra; el Operador es quien la registra</w:t>
+            </w:r>
+          </w:p>
+        </w:tc>
+      </w:tr>
     </w:tbl>
     <w:p>
       <w:pPr>
@@ -2456,6 +2527,19 @@
       </w:pPr>
       <w:r>
         <w:t xml:space="preserve">Product/Sale (catálogo de venta) no se relaciona con Donor ni Frame: son anteojos de sol para financiar la fundación, no marcos donados para beneficiarios — mezclar ambos inventarios sería un acoplamiento accidental.</w:t>
+      </w:r>
+    </w:p>
+    <w:p>
+      <w:pPr>
+        <w:pStyle w:val="ListParagraph"/>
+        <w:numPr>
+          <w:ilvl w:val="0"/>
+          <w:numId w:val="2"/>
+        </w:numPr>
+        <w:spacing w:after="70"/>
+      </w:pPr>
+      <w:r>
+        <w:t xml:space="preserve">Comprador se dibuja con línea punteada porque es una asociación conceptual, no una FK persistida: el comprador no tiene cuenta ni login (consulta el catálogo público, RF-28), y el sistema no guarda su identidad más allá del nombre suelto en Sale.buyerName. Quien efectivamente registra la venta es un Operador — sin login especial para "vendedor" — por eso tampoco aparece una asociación formal Operador–Sale: el sistema no lleva ese registro.</w:t>
       </w:r>
     </w:p>
     <w:p>

</xml_diff>

<commit_message>
fix(docs): alinea la Vista Lógica de Arquitectura con el Modelo de Dominio
La Vista Lógica se armó antes que el Modelo de Dominio dedicado y
había quedado desactualizada: le faltaba la relación Appointment-
Assignment ("retiro de") que sí está en el Modelo de Dominio. Se
agrega esa relación y una nota que remite al Modelo de Dominio para
el detalle completo (incluida la asociación conceptual con Comprador),
para que las dos vistas no vuelvan a divergir. Se actualiza también
el documento combinado del TP.
</commit_message>
<xml_diff>
--- a/docs/TP_ANALISIS_Y_DISENO_BANCO_DE_ANTEOJOS.docx
+++ b/docs/TP_ANALISIS_Y_DISENO_BANCO_DE_ANTEOJOS.docx
@@ -25848,6 +25848,31 @@
       </w:pPr>
       <w:r>
         <w:t xml:space="preserve">Catálogo (Product/Sale) es un dominio intencionalmente independiente: no tiene relación de datos con Donor/Frame — son anteojos de sol para la venta, no marcos donados para beneficiarios.</w:t>
+      </w:r>
+    </w:p>
+    <w:p>
+      <w:pPr>
+        <w:pStyle w:val="ListParagraph"/>
+        <w:numPr>
+          <w:ilvl w:val="0"/>
+          <w:numId w:val="5"/>
+        </w:numPr>
+        <w:spacing w:after="70"/>
+      </w:pPr>
+      <w:r>
+        <w:t xml:space="preserve">Appointment se asocia opcionalmente con Assignment ("retiro de", 0..1–0..1): un turno puede ser para retirar un par puntual, o de atención general (assignment_id nulo).</w:t>
+      </w:r>
+    </w:p>
+    <w:p>
+      <w:pPr>
+        <w:spacing w:after="140"/>
+      </w:pPr>
+      <w:r>
+        <w:rPr>
+          <w:i/>
+          <w:iCs/>
+        </w:rPr>
+        <w:t xml:space="preserve">Este diagrama es un resumen a nivel de arquitectura. El detalle completo de atributos, enumeraciones y asociaciones —incluida la asociación conceptual con Comprador, que no tiene tabla propia— está en el Modelo de Dominio.</w:t>
       </w:r>
     </w:p>
     <w:p>

</xml_diff>